<commit_message>
Sprint final (3 cambios de Diana): bandeja del bot 3 veces/dia en vez de regla 5 min (sin SLA, sin subordinacion), barrido sin filtro + rescate matriculado-referido, LinkedIn 45 min/semana carril ejecutivo con handoff a gerencia + Mensaje 5; embudo al derecho y encabezado corto
Co-Authored-By: Claude Fable 5 <noreply@anthropic.com>
Claude-Session: https://claude.ai/code/session_018H7C5dx3NvDfXiv3CfhPMa
</commit_message>
<xml_diff>
--- a/recursos/comercial/INDUCCION_COMERCIAL/MENSAJES_SPRINT.docx
+++ b/recursos/comercial/INDUCCION_COMERCIAL/MENSAJES_SPRINT.docx
@@ -352,6 +352,55 @@
           <w:color w:val="E54C09"/>
           <w:sz w:val="29"/>
         </w:rPr>
+        <w:t>MENSAJE 5 — LINKEDIN (carril ejecutivo/B2B · las respuestas se agendan para gerencia)</w:t>
+      </w:r>
+    </w:p>
+    <w:tbl>
+      <w:tblPr>
+        <w:tblStyle w:val="TableGrid"/>
+        <w:tblW w:type="auto" w:w="0"/>
+        <w:tblLook w:firstColumn="1" w:firstRow="1" w:lastColumn="0" w:lastRow="0" w:noHBand="0" w:noVBand="1" w:val="04A0"/>
+      </w:tblPr>
+      <w:tblGrid>
+        <w:gridCol w:w="9972"/>
+      </w:tblGrid>
+      <w:tr>
+        <w:tc>
+          <w:tcPr>
+            <w:tcW w:type="dxa" w:w="9972"/>
+            <w:shd w:val="clear" w:fill="FFF8E7"/>
+          </w:tcPr>
+          <w:p>
+            <w:r>
+              <w:rPr>
+                <w:sz w:val="23"/>
+              </w:rPr>
+              <w:t>Hola [nombre], vi tu perfil en [empresa]. Dirijo el área comercial de Heiiu English Academy en Bucaramanga — trabajamos inglés para perfiles ejecutivos y equipos: programas con certificación, avance medido con examen internacional y garantía de aprendizaje por escrito (única en la ciudad), con factura para la empresa. ¿Te interesaría una llamada de 15 minutos con nuestra gerencia para ver si aplica para ti o tu equipo?</w:t>
+            </w:r>
+          </w:p>
+        </w:tc>
+      </w:tr>
+    </w:tbl>
+    <w:p>
+      <w:pPr>
+        <w:spacing w:after="0"/>
+      </w:pPr>
+      <w:r>
+        <w:rPr>
+          <w:sz w:val="8"/>
+        </w:rPr>
+      </w:r>
+    </w:p>
+    <w:p>
+      <w:pPr>
+        <w:spacing w:before="180" w:after="80"/>
+      </w:pPr>
+      <w:r>
+        <w:rPr>
+          <w:b/>
+          <w:color w:val="E54C09"/>
+          <w:sz w:val="29"/>
+        </w:rPr>
         <w:t>LAS 4 REGLAS DE ENVÍO</w:t>
       </w:r>
     </w:p>

</xml_diff>

<commit_message>
Mensaje 6 (respuesta al bravo): un solo mensaje sin discutir, sin repetir acusaciones, sin ofrecer plata; escalar a gerencia mismo dia; estado NO CONTACTAR (reclamo) en planilla — nunca vuelve a tandas
Co-Authored-By: Claude Fable 5 <noreply@anthropic.com>
Claude-Session: https://claude.ai/code/session_018H7C5dx3NvDfXiv3CfhPMa
</commit_message>
<xml_diff>
--- a/recursos/comercial/INDUCCION_COMERCIAL/MENSAJES_SPRINT.docx
+++ b/recursos/comercial/INDUCCION_COMERCIAL/MENSAJES_SPRINT.docx
@@ -401,6 +401,127 @@
           <w:color w:val="E54C09"/>
           <w:sz w:val="29"/>
         </w:rPr>
+        <w:t>MENSAJE 6 — SI RESPONDE BRAVO (reclamo, "mala experiencia", "me estafaron")</w:t>
+      </w:r>
+    </w:p>
+    <w:tbl>
+      <w:tblPr>
+        <w:tblStyle w:val="TableGrid"/>
+        <w:tblW w:type="auto" w:w="0"/>
+        <w:tblLook w:firstColumn="1" w:firstRow="1" w:lastColumn="0" w:lastRow="0" w:noHBand="0" w:noVBand="1" w:val="04A0"/>
+      </w:tblPr>
+      <w:tblGrid>
+        <w:gridCol w:w="9972"/>
+      </w:tblGrid>
+      <w:tr>
+        <w:tc>
+          <w:tcPr>
+            <w:tcW w:type="dxa" w:w="9972"/>
+            <w:shd w:val="clear" w:fill="FFF8E7"/>
+          </w:tcPr>
+          <w:p>
+            <w:r>
+              <w:rPr>
+                <w:sz w:val="23"/>
+              </w:rPr>
+              <w:t>Hola [nombre], gracias por decírmelo con franqueza — y lamento de verdad que tu experiencia no fue la que esperabas. Yo soy nueva en el equipo y no te escribí para discutir ni voy a insistirte con ventas. Lo que sí quiero es que tu caso lo escuche directamente nuestra gerencia: ¿te puede llamar esta semana? Y si prefieres dejarlo hasta aquí, lo respeto y te agradezco que me respondieras.</w:t>
+            </w:r>
+          </w:p>
+        </w:tc>
+      </w:tr>
+    </w:tbl>
+    <w:p>
+      <w:pPr>
+        <w:spacing w:after="0"/>
+      </w:pPr>
+      <w:r>
+        <w:rPr>
+          <w:sz w:val="8"/>
+        </w:rPr>
+      </w:r>
+    </w:p>
+    <w:p>
+      <w:pPr>
+        <w:spacing w:after="80"/>
+      </w:pPr>
+      <w:r>
+        <w:rPr>
+          <w:b/>
+          <w:sz w:val="23"/>
+        </w:rPr>
+        <w:t>LAS 5 REGLAS DEL BRAVO (más importantes que el mensaje):</w:t>
+      </w:r>
+    </w:p>
+    <w:p>
+      <w:pPr>
+        <w:spacing w:after="80"/>
+      </w:pPr>
+      <w:r>
+        <w:rPr>
+          <w:b w:val="0"/>
+          <w:sz w:val="23"/>
+        </w:rPr>
+        <w:t>1. NUNCA discutir, justificar ni contar la versión de la academia por WhatsApp. Un solo mensaje — el de arriba — y silencio.</w:t>
+      </w:r>
+    </w:p>
+    <w:p>
+      <w:pPr>
+        <w:spacing w:after="80"/>
+      </w:pPr>
+      <w:r>
+        <w:rPr>
+          <w:b w:val="0"/>
+          <w:sz w:val="23"/>
+        </w:rPr>
+        <w:t>2. NUNCA repetir por escrito sus palabras ("estafa", "robo") ni aceptar culpa. Se lamenta la EXPERIENCIA, no se admite el cargo.</w:t>
+      </w:r>
+    </w:p>
+    <w:p>
+      <w:pPr>
+        <w:spacing w:after="80"/>
+      </w:pPr>
+      <w:r>
+        <w:rPr>
+          <w:b w:val="0"/>
+          <w:sz w:val="23"/>
+        </w:rPr>
+        <w:t>3. NUNCA ofrecer plata, descuentos ni compensaciones — toda solicitud de devolución va a gerencia con el contrato en mano, jamás se resuelve en el chat.</w:t>
+      </w:r>
+    </w:p>
+    <w:p>
+      <w:pPr>
+        <w:spacing w:after="80"/>
+      </w:pPr>
+      <w:r>
+        <w:rPr>
+          <w:b w:val="0"/>
+          <w:sz w:val="23"/>
+        </w:rPr>
+        <w:t>4. ESCALAR EL MISMO DÍA: pantallazo del reclamo a gerencia — gerencia decide si llama (el que se queja y es escuchado a tiempo, a veces vuelve; el ignorado, demanda).</w:t>
+      </w:r>
+    </w:p>
+    <w:p>
+      <w:pPr>
+        <w:spacing w:after="80"/>
+      </w:pPr>
+      <w:r>
+        <w:rPr>
+          <w:b w:val="0"/>
+          <w:sz w:val="23"/>
+        </w:rPr>
+        <w:t>5. En la planilla: estado NO CONTACTAR (reclamo) + motivo. Ese número NO vuelve a entrar en tandas de rescate ni de referidos. Jamás.</w:t>
+      </w:r>
+    </w:p>
+    <w:p>
+      <w:pPr>
+        <w:spacing w:before="180" w:after="80"/>
+      </w:pPr>
+      <w:r>
+        <w:rPr>
+          <w:b/>
+          <w:color w:val="E54C09"/>
+          <w:sz w:val="29"/>
+        </w:rPr>
         <w:t>LAS 4 REGLAS DE ENVÍO</w:t>
       </w:r>
     </w:p>

</xml_diff>

<commit_message>
Sprint oficial (3 pags, regla 3 clara, revision sabado 10:30) + Duda 4: el contador en tres etapas — 0 vendidos = novedad (acaban de abrirse), 1-4 = ya se estan asignando, 5+ = numero; jamas decir 20 de 20 ni inventar
Co-Authored-By: Claude Fable 5 <noreply@anthropic.com>
Claude-Session: https://claude.ai/code/session_018H7C5dx3NvDfXiv3CfhPMa
</commit_message>
<xml_diff>
--- a/recursos/comercial/INDUCCION_COMERCIAL/MENSAJES_SPRINT.docx
+++ b/recursos/comercial/INDUCCION_COMERCIAL/MENSAJES_SPRINT.docx
@@ -59,7 +59,7 @@
           <w:p>
             <w:r>
               <w:rPr>
-                <w:sz w:val="23"/>
+                <w:sz w:val="22"/>
               </w:rPr>
               <w:t>Hola [nombre] 👋 Soy [asesora] de Heiiu. Hace un tiempo hablamos de tu inglés y hoy te escribo con algo puntual: abrimos cohorte nueva el 5 DE OCTUBRE con precio de lanzamiento — los DOS primeros niveles completos (200 horas presenciales, libros y certificados incluidos) por $2.990.000, con garantía de aprendizaje POR ESCRITO. Son solo 20 cupos y ya se están asignando.</w:t>
             </w:r>
@@ -67,14 +67,14 @@
           <w:p>
             <w:r>
               <w:rPr>
-                <w:sz w:val="23"/>
+                <w:sz w:val="22"/>
               </w:rPr>
             </w:r>
           </w:p>
           <w:p>
             <w:r>
               <w:rPr>
-                <w:sz w:val="23"/>
+                <w:sz w:val="22"/>
               </w:rPr>
               <w:t>¿Retomamos con una cita de 20 minutos? Tengo [día] a las [hora] o [día] a las [hora] — presencial o virtual.</w:t>
             </w:r>
@@ -123,7 +123,7 @@
           <w:p>
             <w:r>
               <w:rPr>
-                <w:sz w:val="23"/>
+                <w:sz w:val="22"/>
               </w:rPr>
               <w:t>Hola [nombre] 👋 Soy [asesora] de Heiiu. Tu A1/A2 quedó ahí guardado — y el inglés que no se usa se oxida. Te escribo porque el Fondo de Becas tiene apertura para paquetes hacia B2 y tu caso aplica a evaluación: retomas donde quedaste y sales con tu B2 completo. ¿Te cuento los números de tu caso en una cita de 20 min? Tengo [día/hora] o [día/hora].</w:t>
             </w:r>
@@ -172,7 +172,7 @@
           <w:p>
             <w:r>
               <w:rPr>
-                <w:sz w:val="23"/>
+                <w:sz w:val="22"/>
               </w:rPr>
               <w:t>Hola [nombre] 👋 Te escribo de Heiiu con una buena para tu gente: abrimos cohorte nueva el 5 DE OCTUBRE — 20 cupos de lanzamiento, los dos primeros niveles completos por $2.990.000 con garantía por escrito.</w:t>
             </w:r>
@@ -180,14 +180,14 @@
           <w:p>
             <w:r>
               <w:rPr>
-                <w:sz w:val="23"/>
+                <w:sz w:val="22"/>
               </w:rPr>
             </w:r>
           </w:p>
           <w:p>
             <w:r>
               <w:rPr>
-                <w:sz w:val="23"/>
+                <w:sz w:val="22"/>
               </w:rPr>
               <w:t>¿Quién de tu círculo lleva años diciendo "necesito el inglés" — un hermano, un amigo, alguien del trabajo? Mándame su nombre y número: entra con solicitud pre-presentada al Fondo de Becas y yo lo atiendo personalmente de tu parte. Los cupos son pocos y tu gente merece el empujón. 💪</w:t>
             </w:r>
@@ -207,7 +207,7 @@
     </w:p>
     <w:p>
       <w:pPr>
-        <w:spacing w:after="80"/>
+        <w:spacing w:after="60"/>
       </w:pPr>
       <w:r>
         <w:rPr>
@@ -248,7 +248,7 @@
           <w:p>
             <w:r>
               <w:rPr>
-                <w:sz w:val="23"/>
+                <w:sz w:val="22"/>
               </w:rPr>
               <w:t>Buen día [nombre], le escribo de Heiiu English Academy — la academia aliada en Bucaramanga. Le cuento algo que les sirve a sus candidatas frenadas por el nivel de inglés: abrimos cohorte el 5 DE OCTUBRE (20 cupos), y nuestro programa termina con el MÓDULO PASAPORTE: la candidata sale con su video de presentación en inglés, su aplicación lista (hoja de vida + carta) y su entrevista con familia ENSAYADA y grabada, además del certificado internacional.</w:t>
             </w:r>
@@ -256,14 +256,14 @@
           <w:p>
             <w:r>
               <w:rPr>
-                <w:sz w:val="23"/>
+                <w:sz w:val="22"/>
               </w:rPr>
             </w:r>
           </w:p>
           <w:p>
             <w:r>
               <w:rPr>
-                <w:sz w:val="23"/>
+                <w:sz w:val="22"/>
               </w:rPr>
               <w:t>Es decir: ustedes reciben candidatas listas para presentar, no candidatas a medio camino. ¿Hablamos 15 minutos esta semana para armar el flujo de remisión? ¿[día/hora] o [día/hora]?</w:t>
             </w:r>
@@ -312,7 +312,7 @@
           <w:p>
             <w:r>
               <w:rPr>
-                <w:sz w:val="23"/>
+                <w:sz w:val="22"/>
               </w:rPr>
               <w:t>🎯 BUCARAMANGA: ¿llevas años diciendo "necesito el inglés"? Abrimos cohorte el 5 DE OCTUBRE — los DOS primeros niveles COMPLETOS (200 horas presenciales, libros y certificado incluidos) por $2.990.000, con GARANTÍA DE APRENDIZAJE POR ESCRITO en tu contrato. Solo 20 cupos de lanzamiento y ya se están asignando. Al terminar sales con tu propia página web publicada o con tu aplicación lista para irte a trabajar afuera. Escríbeme al [número] y te cuento en 5 minutos. 🇺🇸</w:t>
             </w:r>
@@ -332,7 +332,7 @@
     </w:p>
     <w:p>
       <w:pPr>
-        <w:spacing w:after="80"/>
+        <w:spacing w:after="60"/>
       </w:pPr>
       <w:r>
         <w:rPr>
@@ -373,7 +373,7 @@
           <w:p>
             <w:r>
               <w:rPr>
-                <w:sz w:val="23"/>
+                <w:sz w:val="22"/>
               </w:rPr>
               <w:t>Hola [nombre], vi tu perfil en [empresa]. Dirijo el área comercial de Heiiu English Academy en Bucaramanga — trabajamos inglés para perfiles ejecutivos y equipos: programas con certificación, avance medido con examen internacional y garantía de aprendizaje por escrito (única en la ciudad), con factura para la empresa. ¿Te interesaría una llamada de 15 minutos para ver si aplica para ti o tu equipo?</w:t>
             </w:r>
@@ -422,7 +422,7 @@
           <w:p>
             <w:r>
               <w:rPr>
-                <w:sz w:val="23"/>
+                <w:sz w:val="22"/>
               </w:rPr>
               <w:t>Hola [nombre], gracias por decírmelo con franqueza — y lamento de verdad que tu experiencia no fue la que esperabas. Yo soy nueva en el equipo y no te escribí para discutir ni voy a insistirte con ventas. Lo que sí quiero es que tu caso lo escuche directamente nuestra gerencia: ¿te puede llamar esta semana? Y si prefieres dejarlo hasta aquí, lo respeto y te agradezco que me respondieras.</w:t>
             </w:r>
@@ -442,72 +442,72 @@
     </w:p>
     <w:p>
       <w:pPr>
-        <w:spacing w:after="80"/>
+        <w:spacing w:after="60"/>
       </w:pPr>
       <w:r>
         <w:rPr>
           <w:b/>
-          <w:sz w:val="23"/>
+          <w:sz w:val="22"/>
         </w:rPr>
         <w:t>LAS 5 REGLAS DEL BRAVO (más importantes que el mensaje):</w:t>
       </w:r>
     </w:p>
     <w:p>
       <w:pPr>
-        <w:spacing w:after="80"/>
+        <w:spacing w:after="60"/>
       </w:pPr>
       <w:r>
         <w:rPr>
           <w:b w:val="0"/>
-          <w:sz w:val="23"/>
+          <w:sz w:val="22"/>
         </w:rPr>
         <w:t>1. NUNCA discutir, justificar ni contar la versión de la academia por WhatsApp. Un solo mensaje — el de arriba — y silencio.</w:t>
       </w:r>
     </w:p>
     <w:p>
       <w:pPr>
-        <w:spacing w:after="80"/>
+        <w:spacing w:after="60"/>
       </w:pPr>
       <w:r>
         <w:rPr>
           <w:b w:val="0"/>
-          <w:sz w:val="23"/>
+          <w:sz w:val="22"/>
         </w:rPr>
         <w:t>2. NUNCA repetir por escrito sus palabras ("estafa", "robo") ni aceptar culpa. Se lamenta la EXPERIENCIA, no se admite el cargo.</w:t>
       </w:r>
     </w:p>
     <w:p>
       <w:pPr>
-        <w:spacing w:after="80"/>
+        <w:spacing w:after="60"/>
       </w:pPr>
       <w:r>
         <w:rPr>
           <w:b w:val="0"/>
-          <w:sz w:val="23"/>
+          <w:sz w:val="22"/>
         </w:rPr>
         <w:t>3. NUNCA ofrecer plata, descuentos ni compensaciones — toda solicitud de devolución va a gerencia con el contrato en mano, jamás se resuelve en el chat.</w:t>
       </w:r>
     </w:p>
     <w:p>
       <w:pPr>
-        <w:spacing w:after="80"/>
+        <w:spacing w:after="60"/>
       </w:pPr>
       <w:r>
         <w:rPr>
           <w:b w:val="0"/>
-          <w:sz w:val="23"/>
+          <w:sz w:val="22"/>
         </w:rPr>
         <w:t>4. ESCALAR EL MISMO DÍA: pantallazo del reclamo a gerencia — gerencia decide si llama (el que se queja y es escuchado a tiempo, a veces vuelve; el ignorado, demanda).</w:t>
       </w:r>
     </w:p>
     <w:p>
       <w:pPr>
-        <w:spacing w:after="80"/>
+        <w:spacing w:after="60"/>
       </w:pPr>
       <w:r>
         <w:rPr>
           <w:b w:val="0"/>
-          <w:sz w:val="23"/>
+          <w:sz w:val="22"/>
         </w:rPr>
         <w:t>5. En la planilla: estado NO CONTACTAR (reclamo) + motivo. Ese número NO vuelve a entrar en tandas de rescate ni de referidos. Jamás.</w:t>
       </w:r>
@@ -527,48 +527,48 @@
     </w:p>
     <w:p>
       <w:pPr>
-        <w:spacing w:after="80"/>
+        <w:spacing w:after="60"/>
       </w:pPr>
       <w:r>
         <w:rPr>
           <w:b w:val="0"/>
-          <w:sz w:val="23"/>
+          <w:sz w:val="22"/>
         </w:rPr>
         <w:t>1. Personalizar SIEMPRE el nombre — y si hay motivo anotado, abrir con él: "me contaste que en diciembre...".</w:t>
       </w:r>
     </w:p>
     <w:p>
       <w:pPr>
-        <w:spacing w:after="80"/>
+        <w:spacing w:after="60"/>
       </w:pPr>
       <w:r>
         <w:rPr>
           <w:b w:val="0"/>
-          <w:sz w:val="23"/>
+          <w:sz w:val="22"/>
         </w:rPr>
         <w:t>2. Nunca más de un mensaje sin respuesta por día al mismo contacto. Ritmo: mensaje → +24h llamada → +48h último mensaje → comentario con motivo.</w:t>
       </w:r>
     </w:p>
     <w:p>
       <w:pPr>
-        <w:spacing w:after="80"/>
+        <w:spacing w:after="60"/>
       </w:pPr>
       <w:r>
         <w:rPr>
           <w:b w:val="0"/>
-          <w:sz w:val="23"/>
+          <w:sz w:val="22"/>
         </w:rPr>
         <w:t>3. Palabras prohibidas de siempre: gratis, descuento, patrocinio, promesas de visa/empleo.</w:t>
       </w:r>
     </w:p>
     <w:p>
       <w:pPr>
-        <w:spacing w:after="80"/>
+        <w:spacing w:after="60"/>
       </w:pPr>
       <w:r>
         <w:rPr>
           <w:b w:val="0"/>
-          <w:sz w:val="23"/>
+          <w:sz w:val="22"/>
         </w:rPr>
         <w:t>4. El que responde cualquier cosa recibe respuesta a SU pregunta primero, y luego las dos opciones de cita — igual que el bot.</w:t>
       </w:r>
@@ -948,7 +948,7 @@
     <w:rsid w:val="00FC693F"/>
     <w:rPr>
       <w:rFonts w:ascii="Calibri" w:hAnsi="Calibri"/>
-      <w:sz w:val="23"/>
+      <w:sz w:val="22"/>
     </w:rPr>
   </w:style>
   <w:style w:type="paragraph" w:styleId="Header">

</xml_diff>